<commit_message>
fix: quelques petite choses
</commit_message>
<xml_diff>
--- a/Rapport_Technique_Recommandation_Amazon.docx
+++ b/Rapport_Technique_Recommandation_Amazon.docx
@@ -112,7 +112,7 @@
         <w:spacing w:after="40"/>
       </w:pPr>
       <w:r>
-        <w:t>7. Modeles de Machine Learning</w:t>
+        <w:t>7. Agregations de donnees : existantes et proposees</w:t>
       </w:r>
     </w:p>
     <w:p>
@@ -120,7 +120,7 @@
         <w:spacing w:after="40"/>
       </w:pPr>
       <w:r>
-        <w:t>8. Evaluation et optimisation</w:t>
+        <w:t>8. Modeles de Machine Learning</w:t>
       </w:r>
     </w:p>
     <w:p>
@@ -128,7 +128,7 @@
         <w:spacing w:after="40"/>
       </w:pPr>
       <w:r>
-        <w:t>9. API de recommandation</w:t>
+        <w:t>9. Evaluation et optimisation</w:t>
       </w:r>
     </w:p>
     <w:p>
@@ -136,7 +136,7 @@
         <w:spacing w:after="40"/>
       </w:pPr>
       <w:r>
-        <w:t>10. Deploiement et infrastructure</w:t>
+        <w:t>10. API de recommandation</w:t>
       </w:r>
     </w:p>
     <w:p>
@@ -144,7 +144,7 @@
         <w:spacing w:after="40"/>
       </w:pPr>
       <w:r>
-        <w:t>11. Problemes rencontres et decisions de pivot</w:t>
+        <w:t>11. Deploiement et infrastructure</w:t>
       </w:r>
     </w:p>
     <w:p>
@@ -152,7 +152,15 @@
         <w:spacing w:after="40"/>
       </w:pPr>
       <w:r>
-        <w:t>12. Bilan et perspectives</w:t>
+        <w:t>12. Problemes rencontres et decisions de pivot</w:t>
+      </w:r>
+    </w:p>
+    <w:p>
+      <w:pPr>
+        <w:spacing w:after="40"/>
+      </w:pPr>
+      <w:r>
+        <w:t>13. Bilan et perspectives</w:t>
       </w:r>
     </w:p>
     <w:p>
@@ -4400,7 +4408,1388 @@
         <w:pStyle w:val="Heading1"/>
       </w:pPr>
       <w:r>
-        <w:t>7. Modeles de Machine Learning</w:t>
+        <w:t>7. Agregations de donnees : existantes et proposees</w:t>
+      </w:r>
+    </w:p>
+    <w:p>
+      <w:r>
+        <w:t>Les agregations transforment les donnees brutes en informations exploitables par les modeles et l'API. Cette section presente les agregations deja en place dans le pipeline, puis les agregations supplementaires proposees pour enrichir le systeme de recommandation.</w:t>
+      </w:r>
+    </w:p>
+    <w:p>
+      <w:pPr>
+        <w:pStyle w:val="Heading2"/>
+      </w:pPr>
+      <w:r>
+        <w:t>7.1 Agregations existantes</w:t>
+      </w:r>
+    </w:p>
+    <w:p>
+      <w:r>
+        <w:t>Le pipeline actuel (Bronze / Silver / Gold) produit les agregations suivantes :</w:t>
+      </w:r>
+    </w:p>
+    <w:tbl>
+      <w:tblPr>
+        <w:tblStyle w:val="LightGrid-Accent1"/>
+        <w:tblW w:type="auto" w:w="0"/>
+        <w:jc w:val="center"/>
+        <w:tblLook w:firstColumn="1" w:firstRow="1" w:lastColumn="0" w:lastRow="0" w:noHBand="0" w:noVBand="1" w:val="04A0"/>
+      </w:tblPr>
+      <w:tblGrid>
+        <w:gridCol w:w="2160"/>
+        <w:gridCol w:w="2160"/>
+        <w:gridCol w:w="2160"/>
+        <w:gridCol w:w="2160"/>
+      </w:tblGrid>
+      <w:tr>
+        <w:tc>
+          <w:tcPr>
+            <w:tcW w:type="dxa" w:w="2160"/>
+          </w:tcPr>
+          <w:p>
+            <w:r>
+              <w:rPr>
+                <w:b/>
+                <w:sz w:val="20"/>
+              </w:rPr>
+              <w:t>Agregation</w:t>
+            </w:r>
+          </w:p>
+        </w:tc>
+        <w:tc>
+          <w:tcPr>
+            <w:tcW w:type="dxa" w:w="2160"/>
+          </w:tcPr>
+          <w:p>
+            <w:r>
+              <w:rPr>
+                <w:b/>
+                <w:sz w:val="20"/>
+              </w:rPr>
+              <w:t>Niveau</w:t>
+            </w:r>
+          </w:p>
+        </w:tc>
+        <w:tc>
+          <w:tcPr>
+            <w:tcW w:type="dxa" w:w="2160"/>
+          </w:tcPr>
+          <w:p>
+            <w:r>
+              <w:rPr>
+                <w:b/>
+                <w:sz w:val="20"/>
+              </w:rPr>
+              <w:t>Couche</w:t>
+            </w:r>
+          </w:p>
+        </w:tc>
+        <w:tc>
+          <w:tcPr>
+            <w:tcW w:type="dxa" w:w="2160"/>
+          </w:tcPr>
+          <w:p>
+            <w:r>
+              <w:rPr>
+                <w:b/>
+                <w:sz w:val="20"/>
+              </w:rPr>
+              <w:t>Fichier source</w:t>
+            </w:r>
+          </w:p>
+        </w:tc>
+      </w:tr>
+      <w:tr>
+        <w:tc>
+          <w:tcPr>
+            <w:tcW w:type="dxa" w:w="2160"/>
+          </w:tcPr>
+          <w:p>
+            <w:r>
+              <w:rPr>
+                <w:sz w:val="20"/>
+              </w:rPr>
+              <w:t>total_interactions, total_purchases, avg_rating</w:t>
+            </w:r>
+          </w:p>
+        </w:tc>
+        <w:tc>
+          <w:tcPr>
+            <w:tcW w:type="dxa" w:w="2160"/>
+          </w:tcPr>
+          <w:p>
+            <w:r>
+              <w:rPr>
+                <w:sz w:val="20"/>
+              </w:rPr>
+              <w:t>Par utilisateur</w:t>
+            </w:r>
+          </w:p>
+        </w:tc>
+        <w:tc>
+          <w:tcPr>
+            <w:tcW w:type="dxa" w:w="2160"/>
+          </w:tcPr>
+          <w:p>
+            <w:r>
+              <w:rPr>
+                <w:sz w:val="20"/>
+              </w:rPr>
+              <w:t>Bronze</w:t>
+            </w:r>
+          </w:p>
+        </w:tc>
+        <w:tc>
+          <w:tcPr>
+            <w:tcW w:type="dxa" w:w="2160"/>
+          </w:tcPr>
+          <w:p>
+            <w:r>
+              <w:rPr>
+                <w:sz w:val="20"/>
+              </w:rPr>
+              <w:t>00_prepare_data.py</w:t>
+            </w:r>
+          </w:p>
+        </w:tc>
+      </w:tr>
+      <w:tr>
+        <w:tc>
+          <w:tcPr>
+            <w:tcW w:type="dxa" w:w="2160"/>
+          </w:tcPr>
+          <w:p>
+            <w:r>
+              <w:rPr>
+                <w:sz w:val="20"/>
+              </w:rPr>
+              <w:t>segment (power_user / regular_user / casual_user)</w:t>
+            </w:r>
+          </w:p>
+        </w:tc>
+        <w:tc>
+          <w:tcPr>
+            <w:tcW w:type="dxa" w:w="2160"/>
+          </w:tcPr>
+          <w:p>
+            <w:r>
+              <w:rPr>
+                <w:sz w:val="20"/>
+              </w:rPr>
+              <w:t>Par utilisateur</w:t>
+            </w:r>
+          </w:p>
+        </w:tc>
+        <w:tc>
+          <w:tcPr>
+            <w:tcW w:type="dxa" w:w="2160"/>
+          </w:tcPr>
+          <w:p>
+            <w:r>
+              <w:rPr>
+                <w:sz w:val="20"/>
+              </w:rPr>
+              <w:t>Bronze</w:t>
+            </w:r>
+          </w:p>
+        </w:tc>
+        <w:tc>
+          <w:tcPr>
+            <w:tcW w:type="dxa" w:w="2160"/>
+          </w:tcPr>
+          <w:p>
+            <w:r>
+              <w:rPr>
+                <w:sz w:val="20"/>
+              </w:rPr>
+              <w:t>00_prepare_data.py</w:t>
+            </w:r>
+          </w:p>
+        </w:tc>
+      </w:tr>
+      <w:tr>
+        <w:tc>
+          <w:tcPr>
+            <w:tcW w:type="dxa" w:w="2160"/>
+          </w:tcPr>
+          <w:p>
+            <w:r>
+              <w:rPr>
+                <w:sz w:val="20"/>
+              </w:rPr>
+              <w:t>recency_rank (rang par user, tri par timestamp desc)</w:t>
+            </w:r>
+          </w:p>
+        </w:tc>
+        <w:tc>
+          <w:tcPr>
+            <w:tcW w:type="dxa" w:w="2160"/>
+          </w:tcPr>
+          <w:p>
+            <w:r>
+              <w:rPr>
+                <w:sz w:val="20"/>
+              </w:rPr>
+              <w:t>Par interaction</w:t>
+            </w:r>
+          </w:p>
+        </w:tc>
+        <w:tc>
+          <w:tcPr>
+            <w:tcW w:type="dxa" w:w="2160"/>
+          </w:tcPr>
+          <w:p>
+            <w:r>
+              <w:rPr>
+                <w:sz w:val="20"/>
+              </w:rPr>
+              <w:t>Silver</w:t>
+            </w:r>
+          </w:p>
+        </w:tc>
+        <w:tc>
+          <w:tcPr>
+            <w:tcW w:type="dxa" w:w="2160"/>
+          </w:tcPr>
+          <w:p>
+            <w:r>
+              <w:rPr>
+                <w:sz w:val="20"/>
+              </w:rPr>
+              <w:t>silver_cleaning.py</w:t>
+            </w:r>
+          </w:p>
+        </w:tc>
+      </w:tr>
+      <w:tr>
+        <w:tc>
+          <w:tcPr>
+            <w:tcW w:type="dxa" w:w="2160"/>
+          </w:tcPr>
+          <w:p>
+            <w:r>
+              <w:rPr>
+                <w:sz w:val="20"/>
+              </w:rPr>
+              <w:t>user_interaction_count (nombre total par user)</w:t>
+            </w:r>
+          </w:p>
+        </w:tc>
+        <w:tc>
+          <w:tcPr>
+            <w:tcW w:type="dxa" w:w="2160"/>
+          </w:tcPr>
+          <w:p>
+            <w:r>
+              <w:rPr>
+                <w:sz w:val="20"/>
+              </w:rPr>
+              <w:t>Par interaction</w:t>
+            </w:r>
+          </w:p>
+        </w:tc>
+        <w:tc>
+          <w:tcPr>
+            <w:tcW w:type="dxa" w:w="2160"/>
+          </w:tcPr>
+          <w:p>
+            <w:r>
+              <w:rPr>
+                <w:sz w:val="20"/>
+              </w:rPr>
+              <w:t>Silver</w:t>
+            </w:r>
+          </w:p>
+        </w:tc>
+        <w:tc>
+          <w:tcPr>
+            <w:tcW w:type="dxa" w:w="2160"/>
+          </w:tcPr>
+          <w:p>
+            <w:r>
+              <w:rPr>
+                <w:sz w:val="20"/>
+              </w:rPr>
+              <w:t>silver_cleaning.py</w:t>
+            </w:r>
+          </w:p>
+        </w:tc>
+      </w:tr>
+      <w:tr>
+        <w:tc>
+          <w:tcPr>
+            <w:tcW w:type="dxa" w:w="2160"/>
+          </w:tcPr>
+          <w:p>
+            <w:r>
+              <w:rPr>
+                <w:sz w:val="20"/>
+              </w:rPr>
+              <w:t>rf_score (interaction_count / recency_rank)</w:t>
+            </w:r>
+          </w:p>
+        </w:tc>
+        <w:tc>
+          <w:tcPr>
+            <w:tcW w:type="dxa" w:w="2160"/>
+          </w:tcPr>
+          <w:p>
+            <w:r>
+              <w:rPr>
+                <w:sz w:val="20"/>
+              </w:rPr>
+              <w:t>Par interaction</w:t>
+            </w:r>
+          </w:p>
+        </w:tc>
+        <w:tc>
+          <w:tcPr>
+            <w:tcW w:type="dxa" w:w="2160"/>
+          </w:tcPr>
+          <w:p>
+            <w:r>
+              <w:rPr>
+                <w:sz w:val="20"/>
+              </w:rPr>
+              <w:t>Silver</w:t>
+            </w:r>
+          </w:p>
+        </w:tc>
+        <w:tc>
+          <w:tcPr>
+            <w:tcW w:type="dxa" w:w="2160"/>
+          </w:tcPr>
+          <w:p>
+            <w:r>
+              <w:rPr>
+                <w:sz w:val="20"/>
+              </w:rPr>
+              <w:t>silver_cleaning.py</w:t>
+            </w:r>
+          </w:p>
+        </w:tc>
+      </w:tr>
+      <w:tr>
+        <w:tc>
+          <w:tcPr>
+            <w:tcW w:type="dxa" w:w="2160"/>
+          </w:tcPr>
+          <w:p>
+            <w:r>
+              <w:rPr>
+                <w:sz w:val="20"/>
+              </w:rPr>
+              <w:t>nb_interactions, conversion_rate</w:t>
+            </w:r>
+          </w:p>
+        </w:tc>
+        <w:tc>
+          <w:tcPr>
+            <w:tcW w:type="dxa" w:w="2160"/>
+          </w:tcPr>
+          <w:p>
+            <w:r>
+              <w:rPr>
+                <w:sz w:val="20"/>
+              </w:rPr>
+              <w:t>Par produit</w:t>
+            </w:r>
+          </w:p>
+        </w:tc>
+        <w:tc>
+          <w:tcPr>
+            <w:tcW w:type="dxa" w:w="2160"/>
+          </w:tcPr>
+          <w:p>
+            <w:r>
+              <w:rPr>
+                <w:sz w:val="20"/>
+              </w:rPr>
+              <w:t>Gold</w:t>
+            </w:r>
+          </w:p>
+        </w:tc>
+        <w:tc>
+          <w:tcPr>
+            <w:tcW w:type="dxa" w:w="2160"/>
+          </w:tcPr>
+          <w:p>
+            <w:r>
+              <w:rPr>
+                <w:sz w:val="20"/>
+              </w:rPr>
+              <w:t>gold_features.py</w:t>
+            </w:r>
+          </w:p>
+        </w:tc>
+      </w:tr>
+      <w:tr>
+        <w:tc>
+          <w:tcPr>
+            <w:tcW w:type="dxa" w:w="2160"/>
+          </w:tcPr>
+          <w:p>
+            <w:r>
+              <w:rPr>
+                <w:sz w:val="20"/>
+              </w:rPr>
+              <w:t>popularity_score (log1p normalise [0,1])</w:t>
+            </w:r>
+          </w:p>
+        </w:tc>
+        <w:tc>
+          <w:tcPr>
+            <w:tcW w:type="dxa" w:w="2160"/>
+          </w:tcPr>
+          <w:p>
+            <w:r>
+              <w:rPr>
+                <w:sz w:val="20"/>
+              </w:rPr>
+              <w:t>Par produit</w:t>
+            </w:r>
+          </w:p>
+        </w:tc>
+        <w:tc>
+          <w:tcPr>
+            <w:tcW w:type="dxa" w:w="2160"/>
+          </w:tcPr>
+          <w:p>
+            <w:r>
+              <w:rPr>
+                <w:sz w:val="20"/>
+              </w:rPr>
+              <w:t>Gold</w:t>
+            </w:r>
+          </w:p>
+        </w:tc>
+        <w:tc>
+          <w:tcPr>
+            <w:tcW w:type="dxa" w:w="2160"/>
+          </w:tcPr>
+          <w:p>
+            <w:r>
+              <w:rPr>
+                <w:sz w:val="20"/>
+              </w:rPr>
+              <w:t>gold_features.py</w:t>
+            </w:r>
+          </w:p>
+        </w:tc>
+      </w:tr>
+      <w:tr>
+        <w:tc>
+          <w:tcPr>
+            <w:tcW w:type="dxa" w:w="2160"/>
+          </w:tcPr>
+          <w:p>
+            <w:r>
+              <w:rPr>
+                <w:sz w:val="20"/>
+              </w:rPr>
+              <w:t>is_cold (&lt; 5 interactions)</w:t>
+            </w:r>
+          </w:p>
+        </w:tc>
+        <w:tc>
+          <w:tcPr>
+            <w:tcW w:type="dxa" w:w="2160"/>
+          </w:tcPr>
+          <w:p>
+            <w:r>
+              <w:rPr>
+                <w:sz w:val="20"/>
+              </w:rPr>
+              <w:t>Par produit</w:t>
+            </w:r>
+          </w:p>
+        </w:tc>
+        <w:tc>
+          <w:tcPr>
+            <w:tcW w:type="dxa" w:w="2160"/>
+          </w:tcPr>
+          <w:p>
+            <w:r>
+              <w:rPr>
+                <w:sz w:val="20"/>
+              </w:rPr>
+              <w:t>Gold</w:t>
+            </w:r>
+          </w:p>
+        </w:tc>
+        <w:tc>
+          <w:tcPr>
+            <w:tcW w:type="dxa" w:w="2160"/>
+          </w:tcPr>
+          <w:p>
+            <w:r>
+              <w:rPr>
+                <w:sz w:val="20"/>
+              </w:rPr>
+              <w:t>gold_features.py</w:t>
+            </w:r>
+          </w:p>
+        </w:tc>
+      </w:tr>
+    </w:tbl>
+    <w:p/>
+    <w:p>
+      <w:r>
+        <w:t>Ces agregations couvrent les besoins de base du systeme : segmentation utilisateur, scoring de popularite, et tagging cold start. Elles sont calculees dans les couches Silver et Gold du pipeline ETL via PySpark (window functions et groupBy).</w:t>
+      </w:r>
+    </w:p>
+    <w:p>
+      <w:pPr>
+        <w:pStyle w:val="Heading2"/>
+      </w:pPr>
+      <w:r>
+        <w:t>7.2 Agregation par categorie</w:t>
+      </w:r>
+    </w:p>
+    <w:p>
+      <w:r>
+        <w:t>Proposee : calculer nb_users, nb_products, avg_rating, conversion_rate et avg_interactions_per_user par categorie Amazon.</w:t>
+      </w:r>
+    </w:p>
+    <w:p>
+      <w:r>
+        <w:t>Justification : les 5 categories du sous-ensemble ont des profils tres differents. Automotive represente 58 % du volume mais cela ne signifie pas que c'est la categorie avec le meilleur taux de conversion. Cette agregation revelerait les categories sous-exploitees (peu d'interactions mais bon taux de conversion) et les categories a risque (beaucoup de volume mais faible satisfaction). Elle est aussi utile pour ponderer les recommandations cross-categories : si un utilisateur achete principalement dans une categorie a fort taux de conversion, on peut lui proposer des produits similaires dans une categorie adjacente.</w:t>
+      </w:r>
+    </w:p>
+    <w:p>
+      <w:pPr>
+        <w:pStyle w:val="Heading2"/>
+      </w:pPr>
+      <w:r>
+        <w:t>7.3 Agregation par saisonnalite (categorie x mois)</w:t>
+      </w:r>
+    </w:p>
+    <w:p>
+      <w:r>
+        <w:t>Proposee : calculer nb_interactions, conversion_rate et avg_rating par couple (category, year_month).</w:t>
+      </w:r>
+    </w:p>
+    <w:p>
+      <w:r>
+        <w:t>Justification : les comportements d'achat sont saisonniers (Black Friday, Noel, Prime Day). Agreger par categorie et par mois permet de detecter les pics de demande par categorie et d'adapter les recommandations en fonction de la saison. Par exemple, Appliances peut avoir un pic en novembre que All_Beauty n'a pas. C'est aussi un input direct pour le drift monitor : si une categorie chute un mois donne, c'est un signal d'alerte qui peut declencher un re-entrainement du modele.</w:t>
+      </w:r>
+    </w:p>
+    <w:p>
+      <w:pPr>
+        <w:pStyle w:val="Heading2"/>
+      </w:pPr>
+      <w:r>
+        <w:t>7.4 Agregation du profil temporel produit</w:t>
+      </w:r>
+    </w:p>
+    <w:p>
+      <w:r>
+        <w:t>Proposee : calculer first_interaction_date, last_interaction_date, lifespan_days et trend (croissant / decroissant / stable) par produit.</w:t>
+      </w:r>
+    </w:p>
+    <w:p>
+      <w:r>
+        <w:t>Justification : un produit avec 100 interactions reparties sur 2 ans et un produit avec 100 interactions concentrees sur 1 semaine n'ont pas le meme profil. Le trend permet de detecter les produits en train de disparaitre (plus aucune interaction recente) versus les produits en croissance. Recommander un produit en declin est une mauvaise experience utilisateur. Cette feature pourrait etre integree comme filtre post-scoring : penaliser les produits dont le trend est decroissant dans le classement final.</w:t>
+      </w:r>
+    </w:p>
+    <w:p>
+      <w:pPr>
+        <w:pStyle w:val="Heading2"/>
+      </w:pPr>
+      <w:r>
+        <w:t>7.5 Agregation de la diversite d'achat utilisateur</w:t>
+      </w:r>
+    </w:p>
+    <w:p>
+      <w:r>
+        <w:t>Proposee : calculer nb_categories_distinctes, category_principale et indice_diversite (entropie de Shannon sur les categories) par utilisateur.</w:t>
+      </w:r>
+    </w:p>
+    <w:p>
+      <w:pPr>
+        <w:spacing w:before="80" w:after="80"/>
+        <w:ind w:left="567"/>
+      </w:pPr>
+      <w:r>
+        <w:rPr>
+          <w:rFonts w:ascii="Consolas" w:hAnsi="Consolas"/>
+          <w:color w:val="333333"/>
+          <w:sz w:val="18"/>
+        </w:rPr>
+        <w:t>Entropie de Shannon : H = -SUM(p_i * log2(p_i)) pour chaque categorie i</w:t>
+      </w:r>
+    </w:p>
+    <w:p>
+      <w:r>
+        <w:t>Justification : un utilisateur qui achete dans 5 categories differentes et un utilisateur qui n'achete que dans Automotive n'attendent pas les memes recommandations. L'indice de diversite permet de personnaliser la strategie : pour un utilisateur diversifie, on peut proposer du cross-category ; pour un utilisateur specialise, on reste dans sa categorie dominante. Cela enrichit la segmentation au-dela du simple volume (power/regular/casual) en ajoutant une dimension thematique.</w:t>
+      </w:r>
+    </w:p>
+    <w:p>
+      <w:pPr>
+        <w:pStyle w:val="Heading2"/>
+      </w:pPr>
+      <w:r>
+        <w:t>7.6 Agregation de la qualite des reviews par produit</w:t>
+      </w:r>
+    </w:p>
+    <w:p>
+      <w:r>
+        <w:t>Proposee : calculer avg_helpful_votes, pct_verified_purchases, et sentiment_ratio (pourcentage de notes 4-5 etoiles versus 1-2 etoiles) par produit.</w:t>
+      </w:r>
+    </w:p>
+    <w:p>
+      <w:r>
+        <w:t>Justification : le champ helpful_vote est un signal de qualite deja present dans le dataset mais pas encore agrege. Un produit avec beaucoup de votes helpful a des reviews de qualite, ce qui est un indicateur de confiance. Le pct_verified_purchases mesure la proportion d'achats reels versus reviews non verifiees. Ces features pourraient ponderer les interactions dans ALS : une interaction sur un produit de confiance vaut plus qu'une interaction sur un produit douteux. Cela ameliorerait directement la qualite des recommandations sans modifier l'algorithme.</w:t>
+      </w:r>
+    </w:p>
+    <w:p>
+      <w:pPr>
+        <w:pStyle w:val="Heading2"/>
+      </w:pPr>
+      <w:r>
+        <w:t>7.7 Agregation de la matrice segment x categorie</w:t>
+      </w:r>
+    </w:p>
+    <w:p>
+      <w:r>
+        <w:t>Proposee : calculer avg_rating, conversion_rate et nb_interactions par couple (segment, category).</w:t>
+      </w:r>
+    </w:p>
+    <w:tbl>
+      <w:tblPr>
+        <w:tblStyle w:val="LightGrid-Accent1"/>
+        <w:tblW w:type="auto" w:w="0"/>
+        <w:jc w:val="center"/>
+        <w:tblLook w:firstColumn="1" w:firstRow="1" w:lastColumn="0" w:lastRow="0" w:noHBand="0" w:noVBand="1" w:val="04A0"/>
+      </w:tblPr>
+      <w:tblGrid>
+        <w:gridCol w:w="1440"/>
+        <w:gridCol w:w="1440"/>
+        <w:gridCol w:w="1440"/>
+        <w:gridCol w:w="1440"/>
+        <w:gridCol w:w="1440"/>
+        <w:gridCol w:w="1440"/>
+      </w:tblGrid>
+      <w:tr>
+        <w:tc>
+          <w:tcPr>
+            <w:tcW w:type="dxa" w:w="1440"/>
+          </w:tcPr>
+          <w:p>
+            <w:r>
+              <w:rPr>
+                <w:b/>
+                <w:sz w:val="20"/>
+              </w:rPr>
+            </w:r>
+          </w:p>
+        </w:tc>
+        <w:tc>
+          <w:tcPr>
+            <w:tcW w:type="dxa" w:w="1440"/>
+          </w:tcPr>
+          <w:p>
+            <w:r>
+              <w:rPr>
+                <w:b/>
+                <w:sz w:val="20"/>
+              </w:rPr>
+              <w:t>All_Beauty</w:t>
+            </w:r>
+          </w:p>
+        </w:tc>
+        <w:tc>
+          <w:tcPr>
+            <w:tcW w:type="dxa" w:w="1440"/>
+          </w:tcPr>
+          <w:p>
+            <w:r>
+              <w:rPr>
+                <w:b/>
+                <w:sz w:val="20"/>
+              </w:rPr>
+              <w:t>Amazon_Fashion</w:t>
+            </w:r>
+          </w:p>
+        </w:tc>
+        <w:tc>
+          <w:tcPr>
+            <w:tcW w:type="dxa" w:w="1440"/>
+          </w:tcPr>
+          <w:p>
+            <w:r>
+              <w:rPr>
+                <w:b/>
+                <w:sz w:val="20"/>
+              </w:rPr>
+              <w:t>Appliances</w:t>
+            </w:r>
+          </w:p>
+        </w:tc>
+        <w:tc>
+          <w:tcPr>
+            <w:tcW w:type="dxa" w:w="1440"/>
+          </w:tcPr>
+          <w:p>
+            <w:r>
+              <w:rPr>
+                <w:b/>
+                <w:sz w:val="20"/>
+              </w:rPr>
+              <w:t>Arts_Crafts</w:t>
+            </w:r>
+          </w:p>
+        </w:tc>
+        <w:tc>
+          <w:tcPr>
+            <w:tcW w:type="dxa" w:w="1440"/>
+          </w:tcPr>
+          <w:p>
+            <w:r>
+              <w:rPr>
+                <w:b/>
+                <w:sz w:val="20"/>
+              </w:rPr>
+              <w:t>Automotive</w:t>
+            </w:r>
+          </w:p>
+        </w:tc>
+      </w:tr>
+      <w:tr>
+        <w:tc>
+          <w:tcPr>
+            <w:tcW w:type="dxa" w:w="1440"/>
+          </w:tcPr>
+          <w:p>
+            <w:r>
+              <w:rPr>
+                <w:sz w:val="20"/>
+              </w:rPr>
+              <w:t>power_user</w:t>
+            </w:r>
+          </w:p>
+        </w:tc>
+        <w:tc>
+          <w:tcPr>
+            <w:tcW w:type="dxa" w:w="1440"/>
+          </w:tcPr>
+          <w:p>
+            <w:r>
+              <w:rPr>
+                <w:sz w:val="20"/>
+              </w:rPr>
+              <w:t>conv_rate</w:t>
+            </w:r>
+          </w:p>
+        </w:tc>
+        <w:tc>
+          <w:tcPr>
+            <w:tcW w:type="dxa" w:w="1440"/>
+          </w:tcPr>
+          <w:p>
+            <w:r>
+              <w:rPr>
+                <w:sz w:val="20"/>
+              </w:rPr>
+              <w:t>conv_rate</w:t>
+            </w:r>
+          </w:p>
+        </w:tc>
+        <w:tc>
+          <w:tcPr>
+            <w:tcW w:type="dxa" w:w="1440"/>
+          </w:tcPr>
+          <w:p>
+            <w:r>
+              <w:rPr>
+                <w:sz w:val="20"/>
+              </w:rPr>
+              <w:t>conv_rate</w:t>
+            </w:r>
+          </w:p>
+        </w:tc>
+        <w:tc>
+          <w:tcPr>
+            <w:tcW w:type="dxa" w:w="1440"/>
+          </w:tcPr>
+          <w:p>
+            <w:r>
+              <w:rPr>
+                <w:sz w:val="20"/>
+              </w:rPr>
+              <w:t>conv_rate</w:t>
+            </w:r>
+          </w:p>
+        </w:tc>
+        <w:tc>
+          <w:tcPr>
+            <w:tcW w:type="dxa" w:w="1440"/>
+          </w:tcPr>
+          <w:p>
+            <w:r>
+              <w:rPr>
+                <w:sz w:val="20"/>
+              </w:rPr>
+              <w:t>conv_rate</w:t>
+            </w:r>
+          </w:p>
+        </w:tc>
+      </w:tr>
+      <w:tr>
+        <w:tc>
+          <w:tcPr>
+            <w:tcW w:type="dxa" w:w="1440"/>
+          </w:tcPr>
+          <w:p>
+            <w:r>
+              <w:rPr>
+                <w:sz w:val="20"/>
+              </w:rPr>
+              <w:t>regular_user</w:t>
+            </w:r>
+          </w:p>
+        </w:tc>
+        <w:tc>
+          <w:tcPr>
+            <w:tcW w:type="dxa" w:w="1440"/>
+          </w:tcPr>
+          <w:p>
+            <w:r>
+              <w:rPr>
+                <w:sz w:val="20"/>
+              </w:rPr>
+              <w:t>conv_rate</w:t>
+            </w:r>
+          </w:p>
+        </w:tc>
+        <w:tc>
+          <w:tcPr>
+            <w:tcW w:type="dxa" w:w="1440"/>
+          </w:tcPr>
+          <w:p>
+            <w:r>
+              <w:rPr>
+                <w:sz w:val="20"/>
+              </w:rPr>
+              <w:t>conv_rate</w:t>
+            </w:r>
+          </w:p>
+        </w:tc>
+        <w:tc>
+          <w:tcPr>
+            <w:tcW w:type="dxa" w:w="1440"/>
+          </w:tcPr>
+          <w:p>
+            <w:r>
+              <w:rPr>
+                <w:sz w:val="20"/>
+              </w:rPr>
+              <w:t>conv_rate</w:t>
+            </w:r>
+          </w:p>
+        </w:tc>
+        <w:tc>
+          <w:tcPr>
+            <w:tcW w:type="dxa" w:w="1440"/>
+          </w:tcPr>
+          <w:p>
+            <w:r>
+              <w:rPr>
+                <w:sz w:val="20"/>
+              </w:rPr>
+              <w:t>conv_rate</w:t>
+            </w:r>
+          </w:p>
+        </w:tc>
+        <w:tc>
+          <w:tcPr>
+            <w:tcW w:type="dxa" w:w="1440"/>
+          </w:tcPr>
+          <w:p>
+            <w:r>
+              <w:rPr>
+                <w:sz w:val="20"/>
+              </w:rPr>
+              <w:t>conv_rate</w:t>
+            </w:r>
+          </w:p>
+        </w:tc>
+      </w:tr>
+      <w:tr>
+        <w:tc>
+          <w:tcPr>
+            <w:tcW w:type="dxa" w:w="1440"/>
+          </w:tcPr>
+          <w:p>
+            <w:r>
+              <w:rPr>
+                <w:sz w:val="20"/>
+              </w:rPr>
+              <w:t>casual_user</w:t>
+            </w:r>
+          </w:p>
+        </w:tc>
+        <w:tc>
+          <w:tcPr>
+            <w:tcW w:type="dxa" w:w="1440"/>
+          </w:tcPr>
+          <w:p>
+            <w:r>
+              <w:rPr>
+                <w:sz w:val="20"/>
+              </w:rPr>
+              <w:t>conv_rate</w:t>
+            </w:r>
+          </w:p>
+        </w:tc>
+        <w:tc>
+          <w:tcPr>
+            <w:tcW w:type="dxa" w:w="1440"/>
+          </w:tcPr>
+          <w:p>
+            <w:r>
+              <w:rPr>
+                <w:sz w:val="20"/>
+              </w:rPr>
+              <w:t>conv_rate</w:t>
+            </w:r>
+          </w:p>
+        </w:tc>
+        <w:tc>
+          <w:tcPr>
+            <w:tcW w:type="dxa" w:w="1440"/>
+          </w:tcPr>
+          <w:p>
+            <w:r>
+              <w:rPr>
+                <w:sz w:val="20"/>
+              </w:rPr>
+              <w:t>conv_rate</w:t>
+            </w:r>
+          </w:p>
+        </w:tc>
+        <w:tc>
+          <w:tcPr>
+            <w:tcW w:type="dxa" w:w="1440"/>
+          </w:tcPr>
+          <w:p>
+            <w:r>
+              <w:rPr>
+                <w:sz w:val="20"/>
+              </w:rPr>
+              <w:t>conv_rate</w:t>
+            </w:r>
+          </w:p>
+        </w:tc>
+        <w:tc>
+          <w:tcPr>
+            <w:tcW w:type="dxa" w:w="1440"/>
+          </w:tcPr>
+          <w:p>
+            <w:r>
+              <w:rPr>
+                <w:sz w:val="20"/>
+              </w:rPr>
+              <w:t>conv_rate</w:t>
+            </w:r>
+          </w:p>
+        </w:tc>
+      </w:tr>
+    </w:tbl>
+    <w:p/>
+    <w:p>
+      <w:r>
+        <w:t>Justification : les power users n'achetent pas les memes categories que les casual users. Cette matrice revele les affinites segment-categorie. Elle est particulierement utile pour le cold start : pour un nouvel utilisateur dont on connait le segment (via une heuristique basee sur son premier achat), on peut deja biaiser les recommandations vers les categories preferees de son segment, au lieu de tomber sur un simple fallback popularite global.</w:t>
+      </w:r>
+    </w:p>
+    <w:p>
+      <w:pPr>
+        <w:pStyle w:val="Heading2"/>
+      </w:pPr>
+      <w:r>
+        <w:t>7.8 Agregation du pattern temporel utilisateur</w:t>
+      </w:r>
+    </w:p>
+    <w:p>
+      <w:r>
+        <w:t>Proposee : calculer avg_days_between_purchases, regularity_score (ecart-type normalise des intervalles entre achats) et last_purchase_days_ago par utilisateur.</w:t>
+      </w:r>
+    </w:p>
+    <w:p>
+      <w:r>
+        <w:t>Justification : distinguer les acheteurs reguliers (tous les mois) des acheteurs ponctuels (une fois par an). Le last_purchase_days_ago detecte les utilisateurs en train de churner. Cela permet de prioriser les recommandations pour les utilisateurs a risque de churn et d'adapter la frequence des suggestions. Un utilisateur regulier qui n'a pas achete depuis 3 mois est un signal d'alerte ; un acheteur annuel qui n'a pas achete depuis 3 mois est normal.</w:t>
+      </w:r>
+    </w:p>
+    <w:p>
+      <w:pPr>
+        <w:pStyle w:val="Heading2"/>
+      </w:pPr>
+      <w:r>
+        <w:t>7.9 Synthese et impact sur le systeme</w:t>
+      </w:r>
+    </w:p>
+    <w:tbl>
+      <w:tblPr>
+        <w:tblStyle w:val="LightGrid-Accent1"/>
+        <w:tblW w:type="auto" w:w="0"/>
+        <w:jc w:val="center"/>
+        <w:tblLook w:firstColumn="1" w:firstRow="1" w:lastColumn="0" w:lastRow="0" w:noHBand="0" w:noVBand="1" w:val="04A0"/>
+      </w:tblPr>
+      <w:tblGrid>
+        <w:gridCol w:w="2880"/>
+        <w:gridCol w:w="2880"/>
+        <w:gridCol w:w="2880"/>
+      </w:tblGrid>
+      <w:tr>
+        <w:tc>
+          <w:tcPr>
+            <w:tcW w:type="dxa" w:w="2880"/>
+          </w:tcPr>
+          <w:p>
+            <w:r>
+              <w:rPr>
+                <w:b/>
+                <w:sz w:val="20"/>
+              </w:rPr>
+              <w:t>Agregation</w:t>
+            </w:r>
+          </w:p>
+        </w:tc>
+        <w:tc>
+          <w:tcPr>
+            <w:tcW w:type="dxa" w:w="2880"/>
+          </w:tcPr>
+          <w:p>
+            <w:r>
+              <w:rPr>
+                <w:b/>
+                <w:sz w:val="20"/>
+              </w:rPr>
+              <w:t>Niveau</w:t>
+            </w:r>
+          </w:p>
+        </w:tc>
+        <w:tc>
+          <w:tcPr>
+            <w:tcW w:type="dxa" w:w="2880"/>
+          </w:tcPr>
+          <w:p>
+            <w:r>
+              <w:rPr>
+                <w:b/>
+                <w:sz w:val="20"/>
+              </w:rPr>
+              <w:t>Impact principal</w:t>
+            </w:r>
+          </w:p>
+        </w:tc>
+      </w:tr>
+      <w:tr>
+        <w:tc>
+          <w:tcPr>
+            <w:tcW w:type="dxa" w:w="2880"/>
+          </w:tcPr>
+          <w:p>
+            <w:r>
+              <w:rPr>
+                <w:sz w:val="20"/>
+              </w:rPr>
+              <w:t>Stats par categorie</w:t>
+            </w:r>
+          </w:p>
+        </w:tc>
+        <w:tc>
+          <w:tcPr>
+            <w:tcW w:type="dxa" w:w="2880"/>
+          </w:tcPr>
+          <w:p>
+            <w:r>
+              <w:rPr>
+                <w:sz w:val="20"/>
+              </w:rPr>
+              <w:t>Categorie</w:t>
+            </w:r>
+          </w:p>
+        </w:tc>
+        <w:tc>
+          <w:tcPr>
+            <w:tcW w:type="dxa" w:w="2880"/>
+          </w:tcPr>
+          <w:p>
+            <w:r>
+              <w:rPr>
+                <w:sz w:val="20"/>
+              </w:rPr>
+              <w:t>Comparaison et ponderation cross-category</w:t>
+            </w:r>
+          </w:p>
+        </w:tc>
+      </w:tr>
+      <w:tr>
+        <w:tc>
+          <w:tcPr>
+            <w:tcW w:type="dxa" w:w="2880"/>
+          </w:tcPr>
+          <w:p>
+            <w:r>
+              <w:rPr>
+                <w:sz w:val="20"/>
+              </w:rPr>
+              <w:t>Saisonnalite</w:t>
+            </w:r>
+          </w:p>
+        </w:tc>
+        <w:tc>
+          <w:tcPr>
+            <w:tcW w:type="dxa" w:w="2880"/>
+          </w:tcPr>
+          <w:p>
+            <w:r>
+              <w:rPr>
+                <w:sz w:val="20"/>
+              </w:rPr>
+              <w:t>Categorie x Mois</w:t>
+            </w:r>
+          </w:p>
+        </w:tc>
+        <w:tc>
+          <w:tcPr>
+            <w:tcW w:type="dxa" w:w="2880"/>
+          </w:tcPr>
+          <w:p>
+            <w:r>
+              <w:rPr>
+                <w:sz w:val="20"/>
+              </w:rPr>
+              <w:t>Recommandations contextuelles, drift detection</w:t>
+            </w:r>
+          </w:p>
+        </w:tc>
+      </w:tr>
+      <w:tr>
+        <w:tc>
+          <w:tcPr>
+            <w:tcW w:type="dxa" w:w="2880"/>
+          </w:tcPr>
+          <w:p>
+            <w:r>
+              <w:rPr>
+                <w:sz w:val="20"/>
+              </w:rPr>
+              <w:t>Profil temporel produit</w:t>
+            </w:r>
+          </w:p>
+        </w:tc>
+        <w:tc>
+          <w:tcPr>
+            <w:tcW w:type="dxa" w:w="2880"/>
+          </w:tcPr>
+          <w:p>
+            <w:r>
+              <w:rPr>
+                <w:sz w:val="20"/>
+              </w:rPr>
+              <w:t>Produit</w:t>
+            </w:r>
+          </w:p>
+        </w:tc>
+        <w:tc>
+          <w:tcPr>
+            <w:tcW w:type="dxa" w:w="2880"/>
+          </w:tcPr>
+          <w:p>
+            <w:r>
+              <w:rPr>
+                <w:sz w:val="20"/>
+              </w:rPr>
+              <w:t>Eviter de recommander des produits en declin</w:t>
+            </w:r>
+          </w:p>
+        </w:tc>
+      </w:tr>
+      <w:tr>
+        <w:tc>
+          <w:tcPr>
+            <w:tcW w:type="dxa" w:w="2880"/>
+          </w:tcPr>
+          <w:p>
+            <w:r>
+              <w:rPr>
+                <w:sz w:val="20"/>
+              </w:rPr>
+              <w:t>Diversite d'achat</w:t>
+            </w:r>
+          </w:p>
+        </w:tc>
+        <w:tc>
+          <w:tcPr>
+            <w:tcW w:type="dxa" w:w="2880"/>
+          </w:tcPr>
+          <w:p>
+            <w:r>
+              <w:rPr>
+                <w:sz w:val="20"/>
+              </w:rPr>
+              <w:t>Utilisateur</w:t>
+            </w:r>
+          </w:p>
+        </w:tc>
+        <w:tc>
+          <w:tcPr>
+            <w:tcW w:type="dxa" w:w="2880"/>
+          </w:tcPr>
+          <w:p>
+            <w:r>
+              <w:rPr>
+                <w:sz w:val="20"/>
+              </w:rPr>
+              <w:t>Strategie cross-category vs intra-category</w:t>
+            </w:r>
+          </w:p>
+        </w:tc>
+      </w:tr>
+      <w:tr>
+        <w:tc>
+          <w:tcPr>
+            <w:tcW w:type="dxa" w:w="2880"/>
+          </w:tcPr>
+          <w:p>
+            <w:r>
+              <w:rPr>
+                <w:sz w:val="20"/>
+              </w:rPr>
+              <w:t>Qualite des reviews</w:t>
+            </w:r>
+          </w:p>
+        </w:tc>
+        <w:tc>
+          <w:tcPr>
+            <w:tcW w:type="dxa" w:w="2880"/>
+          </w:tcPr>
+          <w:p>
+            <w:r>
+              <w:rPr>
+                <w:sz w:val="20"/>
+              </w:rPr>
+              <w:t>Produit</w:t>
+            </w:r>
+          </w:p>
+        </w:tc>
+        <w:tc>
+          <w:tcPr>
+            <w:tcW w:type="dxa" w:w="2880"/>
+          </w:tcPr>
+          <w:p>
+            <w:r>
+              <w:rPr>
+                <w:sz w:val="20"/>
+              </w:rPr>
+              <w:t>Ponderation de la confiance dans ALS</w:t>
+            </w:r>
+          </w:p>
+        </w:tc>
+      </w:tr>
+      <w:tr>
+        <w:tc>
+          <w:tcPr>
+            <w:tcW w:type="dxa" w:w="2880"/>
+          </w:tcPr>
+          <w:p>
+            <w:r>
+              <w:rPr>
+                <w:sz w:val="20"/>
+              </w:rPr>
+              <w:t>Matrice segment x categorie</w:t>
+            </w:r>
+          </w:p>
+        </w:tc>
+        <w:tc>
+          <w:tcPr>
+            <w:tcW w:type="dxa" w:w="2880"/>
+          </w:tcPr>
+          <w:p>
+            <w:r>
+              <w:rPr>
+                <w:sz w:val="20"/>
+              </w:rPr>
+              <w:t>Segment x Categorie</w:t>
+            </w:r>
+          </w:p>
+        </w:tc>
+        <w:tc>
+          <w:tcPr>
+            <w:tcW w:type="dxa" w:w="2880"/>
+          </w:tcPr>
+          <w:p>
+            <w:r>
+              <w:rPr>
+                <w:sz w:val="20"/>
+              </w:rPr>
+              <w:t>Cold start plus intelligent</w:t>
+            </w:r>
+          </w:p>
+        </w:tc>
+      </w:tr>
+      <w:tr>
+        <w:tc>
+          <w:tcPr>
+            <w:tcW w:type="dxa" w:w="2880"/>
+          </w:tcPr>
+          <w:p>
+            <w:r>
+              <w:rPr>
+                <w:sz w:val="20"/>
+              </w:rPr>
+              <w:t>Pattern temporel user</w:t>
+            </w:r>
+          </w:p>
+        </w:tc>
+        <w:tc>
+          <w:tcPr>
+            <w:tcW w:type="dxa" w:w="2880"/>
+          </w:tcPr>
+          <w:p>
+            <w:r>
+              <w:rPr>
+                <w:sz w:val="20"/>
+              </w:rPr>
+              <w:t>Utilisateur</w:t>
+            </w:r>
+          </w:p>
+        </w:tc>
+        <w:tc>
+          <w:tcPr>
+            <w:tcW w:type="dxa" w:w="2880"/>
+          </w:tcPr>
+          <w:p>
+            <w:r>
+              <w:rPr>
+                <w:sz w:val="20"/>
+              </w:rPr>
+              <w:t>Detection de churn, frequence de suggestion</w:t>
+            </w:r>
+          </w:p>
+        </w:tc>
+      </w:tr>
+    </w:tbl>
+    <w:p/>
+    <w:p>
+      <w:r>
+        <w:t>Les trois agregations les plus impactantes pour le systeme actuel sont : (1) la diversite d'achat, qui ameliore directement le recommender en personnalisant la strategie cross-category ; (2) la qualite des reviews, qui ameliore ALS via une ponderation de confiance sur les interactions ; et (3) la saisonnalite, qui rend les recommandations contextuelles et alimente le drift monitor.</w:t>
+      </w:r>
+    </w:p>
+    <w:p>
+      <w:r>
+        <w:br w:type="page"/>
+      </w:r>
+    </w:p>
+    <w:p>
+      <w:pPr>
+        <w:pStyle w:val="Heading1"/>
+      </w:pPr>
+      <w:r>
+        <w:t>8. Modeles de Machine Learning</w:t>
       </w:r>
     </w:p>
     <w:p>
@@ -4413,7 +5802,7 @@
         <w:pStyle w:val="Heading2"/>
       </w:pPr>
       <w:r>
-        <w:t>7.1 Sentence Transformers : embeddings de contenu</w:t>
+        <w:t>8.1 Sentence Transformers : embeddings de contenu</w:t>
       </w:r>
     </w:p>
     <w:tbl>
@@ -4614,7 +6003,7 @@
         <w:pStyle w:val="Heading2"/>
       </w:pPr>
       <w:r>
-        <w:t>7.2 ALS : factorisation matricielle</w:t>
+        <w:t>8.2 ALS : factorisation matricielle</w:t>
       </w:r>
     </w:p>
     <w:p>
@@ -4899,7 +6288,7 @@
         <w:pStyle w:val="Heading2"/>
       </w:pPr>
       <w:r>
-        <w:t>7.3 Bridge Model : resolution du cold start</w:t>
+        <w:t>8.3 Bridge Model : resolution du cold start</w:t>
       </w:r>
     </w:p>
     <w:p>
@@ -5379,7 +6768,7 @@
         <w:pStyle w:val="Heading1"/>
       </w:pPr>
       <w:r>
-        <w:t>8. Evaluation et optimisation</w:t>
+        <w:t>9. Evaluation et optimisation</w:t>
       </w:r>
     </w:p>
     <w:p>
@@ -5387,12 +6776,36 @@
         <w:pStyle w:val="Heading2"/>
       </w:pPr>
       <w:r>
-        <w:t>8.1 Metrique principale : NDCG@10</w:t>
+        <w:t>9.1 Metrique principale : NDCG@10 et Lift</w:t>
       </w:r>
     </w:p>
     <w:p>
       <w:r>
-        <w:t>Le NDCG (Normalized Discounted Cumulative Gain) a 10 est la metrique standard pour evaluer les systemes de recommandation. Elle mesure la qualite du classement des recommandations en penalisant les items pertinents places trop bas.</w:t>
+        <w:t>Le NDCG (Normalized Discounted Cumulative Gain) a 10 est la metrique standard pour evaluer les systemes de recommandation. Elle mesure la qualite du classement des recommandations en penalisant les items pertinents places trop bas dans la liste. Un NDCG@10 de 1.0 signifie que tous les items pertinents sont dans le top 10 et dans l'ordre parfait ; un score de 0.0 signifie qu'aucun item pertinent n'apparait dans le top 10.</w:t>
+      </w:r>
+    </w:p>
+    <w:p>
+      <w:r>
+        <w:t>Le lift mesure l'amelioration relative du modele ALS par rapport a la baseline de popularite. Il se calcule comme suit :</w:t>
+      </w:r>
+    </w:p>
+    <w:p>
+      <w:pPr>
+        <w:spacing w:before="80" w:after="80"/>
+        <w:ind w:left="567"/>
+      </w:pPr>
+      <w:r>
+        <w:rPr>
+          <w:rFonts w:ascii="Consolas" w:hAnsi="Consolas"/>
+          <w:color w:val="333333"/>
+          <w:sz w:val="18"/>
+        </w:rPr>
+        <w:t>Lift (%) = (NDCG_ALS - NDCG_popularite) / NDCG_popularite x 100</w:t>
+      </w:r>
+    </w:p>
+    <w:p>
+      <w:r>
+        <w:t>Un lift positif signifie que le modele ALS recommande mieux que la simple popularite. Un lift negatif signifie que la baseline de popularite surpasse ALS, ce qui arrive typiquement quand les donnees sont extremement creuses : la popularite est une heuristique robuste car elle recommande les produits les plus frequents, qui ont mecaniquement plus de chances d'apparaitre dans le test set.</w:t>
       </w:r>
     </w:p>
     <w:p>
@@ -5433,11 +6846,289 @@
       </w:r>
     </w:p>
     <w:p>
+      <w:r>
+        <w:t>Resultats obtenus sur le sous-ensemble de 2 categories (All Beauty, Amazon Fashion) :</w:t>
+      </w:r>
+    </w:p>
+    <w:tbl>
+      <w:tblPr>
+        <w:tblStyle w:val="LightGrid-Accent1"/>
+        <w:tblW w:type="auto" w:w="0"/>
+        <w:jc w:val="center"/>
+        <w:tblLook w:firstColumn="1" w:firstRow="1" w:lastColumn="0" w:lastRow="0" w:noHBand="0" w:noVBand="1" w:val="04A0"/>
+      </w:tblPr>
+      <w:tblGrid>
+        <w:gridCol w:w="2880"/>
+        <w:gridCol w:w="2880"/>
+        <w:gridCol w:w="2880"/>
+      </w:tblGrid>
+      <w:tr>
+        <w:tc>
+          <w:tcPr>
+            <w:tcW w:type="dxa" w:w="2880"/>
+          </w:tcPr>
+          <w:p>
+            <w:r>
+              <w:rPr>
+                <w:b/>
+                <w:sz w:val="20"/>
+              </w:rPr>
+              <w:t>Modele</w:t>
+            </w:r>
+          </w:p>
+        </w:tc>
+        <w:tc>
+          <w:tcPr>
+            <w:tcW w:type="dxa" w:w="2880"/>
+          </w:tcPr>
+          <w:p>
+            <w:r>
+              <w:rPr>
+                <w:b/>
+                <w:sz w:val="20"/>
+              </w:rPr>
+              <w:t>NDCG@10</w:t>
+            </w:r>
+          </w:p>
+        </w:tc>
+        <w:tc>
+          <w:tcPr>
+            <w:tcW w:type="dxa" w:w="2880"/>
+          </w:tcPr>
+          <w:p>
+            <w:r>
+              <w:rPr>
+                <w:b/>
+                <w:sz w:val="20"/>
+              </w:rPr>
+              <w:t>Lift vs popularite</w:t>
+            </w:r>
+          </w:p>
+        </w:tc>
+      </w:tr>
+      <w:tr>
+        <w:tc>
+          <w:tcPr>
+            <w:tcW w:type="dxa" w:w="2880"/>
+          </w:tcPr>
+          <w:p>
+            <w:r>
+              <w:rPr>
+                <w:sz w:val="20"/>
+              </w:rPr>
+              <w:t>Baseline popularite</w:t>
+            </w:r>
+          </w:p>
+        </w:tc>
+        <w:tc>
+          <w:tcPr>
+            <w:tcW w:type="dxa" w:w="2880"/>
+          </w:tcPr>
+          <w:p>
+            <w:r>
+              <w:rPr>
+                <w:sz w:val="20"/>
+              </w:rPr>
+              <w:t>0.0010</w:t>
+            </w:r>
+          </w:p>
+        </w:tc>
+        <w:tc>
+          <w:tcPr>
+            <w:tcW w:type="dxa" w:w="2880"/>
+          </w:tcPr>
+          <w:p>
+            <w:r>
+              <w:rPr>
+                <w:sz w:val="20"/>
+              </w:rPr>
+              <w:t>-</w:t>
+            </w:r>
+          </w:p>
+        </w:tc>
+      </w:tr>
+      <w:tr>
+        <w:tc>
+          <w:tcPr>
+            <w:tcW w:type="dxa" w:w="2880"/>
+          </w:tcPr>
+          <w:p>
+            <w:r>
+              <w:rPr>
+                <w:sz w:val="20"/>
+              </w:rPr>
+              <w:t>ALS (rank=32, reg=0.5, iter=10) — meilleur run</w:t>
+            </w:r>
+          </w:p>
+        </w:tc>
+        <w:tc>
+          <w:tcPr>
+            <w:tcW w:type="dxa" w:w="2880"/>
+          </w:tcPr>
+          <w:p>
+            <w:r>
+              <w:rPr>
+                <w:sz w:val="20"/>
+              </w:rPr>
+              <w:t>0.0007</w:t>
+            </w:r>
+          </w:p>
+        </w:tc>
+        <w:tc>
+          <w:tcPr>
+            <w:tcW w:type="dxa" w:w="2880"/>
+          </w:tcPr>
+          <w:p>
+            <w:r>
+              <w:rPr>
+                <w:sz w:val="20"/>
+              </w:rPr>
+              <w:t>-29.0 %</w:t>
+            </w:r>
+          </w:p>
+        </w:tc>
+      </w:tr>
+      <w:tr>
+        <w:tc>
+          <w:tcPr>
+            <w:tcW w:type="dxa" w:w="2880"/>
+          </w:tcPr>
+          <w:p>
+            <w:r>
+              <w:rPr>
+                <w:sz w:val="20"/>
+              </w:rPr>
+              <w:t>ALS (rank=32, reg=0.01, iter=10)</w:t>
+            </w:r>
+          </w:p>
+        </w:tc>
+        <w:tc>
+          <w:tcPr>
+            <w:tcW w:type="dxa" w:w="2880"/>
+          </w:tcPr>
+          <w:p>
+            <w:r>
+              <w:rPr>
+                <w:sz w:val="20"/>
+              </w:rPr>
+              <w:t>0.0006</w:t>
+            </w:r>
+          </w:p>
+        </w:tc>
+        <w:tc>
+          <w:tcPr>
+            <w:tcW w:type="dxa" w:w="2880"/>
+          </w:tcPr>
+          <w:p>
+            <w:r>
+              <w:rPr>
+                <w:sz w:val="20"/>
+              </w:rPr>
+              <w:t>-44.0 %</w:t>
+            </w:r>
+          </w:p>
+        </w:tc>
+      </w:tr>
+      <w:tr>
+        <w:tc>
+          <w:tcPr>
+            <w:tcW w:type="dxa" w:w="2880"/>
+          </w:tcPr>
+          <w:p>
+            <w:r>
+              <w:rPr>
+                <w:sz w:val="20"/>
+              </w:rPr>
+              <w:t>ALS (rank=16, reg=0.5, iter=20)</w:t>
+            </w:r>
+          </w:p>
+        </w:tc>
+        <w:tc>
+          <w:tcPr>
+            <w:tcW w:type="dxa" w:w="2880"/>
+          </w:tcPr>
+          <w:p>
+            <w:r>
+              <w:rPr>
+                <w:sz w:val="20"/>
+              </w:rPr>
+              <w:t>0.0005</w:t>
+            </w:r>
+          </w:p>
+        </w:tc>
+        <w:tc>
+          <w:tcPr>
+            <w:tcW w:type="dxa" w:w="2880"/>
+          </w:tcPr>
+          <w:p>
+            <w:r>
+              <w:rPr>
+                <w:sz w:val="20"/>
+              </w:rPr>
+              <w:t>-55.9 %</w:t>
+            </w:r>
+          </w:p>
+        </w:tc>
+      </w:tr>
+      <w:tr>
+        <w:tc>
+          <w:tcPr>
+            <w:tcW w:type="dxa" w:w="2880"/>
+          </w:tcPr>
+          <w:p>
+            <w:r>
+              <w:rPr>
+                <w:sz w:val="20"/>
+              </w:rPr>
+              <w:t>ALS (rank=8, reg=0.5, iter=10)</w:t>
+            </w:r>
+          </w:p>
+        </w:tc>
+        <w:tc>
+          <w:tcPr>
+            <w:tcW w:type="dxa" w:w="2880"/>
+          </w:tcPr>
+          <w:p>
+            <w:r>
+              <w:rPr>
+                <w:sz w:val="20"/>
+              </w:rPr>
+              <w:t>0.0001</w:t>
+            </w:r>
+          </w:p>
+        </w:tc>
+        <w:tc>
+          <w:tcPr>
+            <w:tcW w:type="dxa" w:w="2880"/>
+          </w:tcPr>
+          <w:p>
+            <w:r>
+              <w:rPr>
+                <w:sz w:val="20"/>
+              </w:rPr>
+              <w:t>-92.4 %</w:t>
+            </w:r>
+          </w:p>
+        </w:tc>
+      </w:tr>
+    </w:tbl>
+    <w:p/>
+    <w:p>
+      <w:r>
+        <w:t>Analyse du lift negatif : sur ce sous-ensemble de donnees, le lift est systematiquement negatif. Cela s'explique par la sparsity extreme (99,9999 %) combinee au filtrage sur seulement 2 categories. Avec 91,6 % des utilisateurs ayant moins de 5 interactions, ALS ne dispose pas de suffisamment de signal pour construire des facteurs latents fiables. La baseline popularite, qui recommande les produits les plus frequents toutes categories confondues, beneficie d'un avantage statistique dans ce contexte : les produits populaires ont mecaniquement plus de chances d'apparaitre dans le test set d'un utilisateur quelconque.</w:t>
+      </w:r>
+    </w:p>
+    <w:p>
+      <w:r>
+        <w:t>Ce resultat est attendu et documente dans la litterature (Dacrema et al., 2019 : 'Are We Really Making Much Progress?'). Il justifie pleinement l'architecture hybride mise en place : le bridge model et les embeddings semantiques compensent les faiblesses d'ALS sur les entites cold, tandis que l'A/B testing en production permettra de mesurer le lift reel sur le trafic utilisateur avec un volume d'interactions suffisant.</w:t>
+      </w:r>
+    </w:p>
+    <w:p>
       <w:pPr>
         <w:pStyle w:val="Heading2"/>
       </w:pPr>
       <w:r>
-        <w:t>8.2 Grid search des hyperparametres</w:t>
+        <w:t>9.2 Grid search des hyperparametres</w:t>
       </w:r>
     </w:p>
     <w:p>
@@ -5582,7 +7273,7 @@
         <w:pStyle w:val="Heading2"/>
       </w:pPr>
       <w:r>
-        <w:t>8.3 Pistes d'optimisation identifiees</w:t>
+        <w:t>9.3 Pistes d'optimisation identifiees</w:t>
       </w:r>
     </w:p>
     <w:p>
@@ -5661,7 +7352,7 @@
         <w:pStyle w:val="Heading1"/>
       </w:pPr>
       <w:r>
-        <w:t>9. API de recommandation</w:t>
+        <w:t>10. API de recommandation</w:t>
       </w:r>
     </w:p>
     <w:p>
@@ -5669,7 +7360,7 @@
         <w:pStyle w:val="Heading2"/>
       </w:pPr>
       <w:r>
-        <w:t>9.1 Choix technologiques</w:t>
+        <w:t>10.1 Choix technologiques</w:t>
       </w:r>
     </w:p>
     <w:p>
@@ -5714,7 +7405,7 @@
         <w:pStyle w:val="Heading2"/>
       </w:pPr>
       <w:r>
-        <w:t>9.2 Endpoints</w:t>
+        <w:t>10.2 Endpoints</w:t>
       </w:r>
     </w:p>
     <w:tbl>
@@ -6065,7 +7756,7 @@
         <w:pStyle w:val="Heading2"/>
       </w:pPr>
       <w:r>
-        <w:t>9.3 Cache Redis</w:t>
+        <w:t>10.3 Cache Redis</w:t>
       </w:r>
     </w:p>
     <w:p>
@@ -6083,7 +7774,7 @@
         <w:pStyle w:val="Heading2"/>
       </w:pPr>
       <w:r>
-        <w:t>9.4 A/B Testing integre</w:t>
+        <w:t>10.4 A/B Testing integre</w:t>
       </w:r>
     </w:p>
     <w:p>
@@ -6144,7 +7835,7 @@
         <w:pStyle w:val="Heading2"/>
       </w:pPr>
       <w:r>
-        <w:t>9.5 Chargement des donnees en memoire</w:t>
+        <w:t>10.5 Chargement des donnees en memoire</w:t>
       </w:r>
     </w:p>
     <w:p>
@@ -6167,7 +7858,7 @@
         <w:pStyle w:val="Heading1"/>
       </w:pPr>
       <w:r>
-        <w:t>10. Deploiement et infrastructure</w:t>
+        <w:t>11. Deploiement et infrastructure</w:t>
       </w:r>
     </w:p>
     <w:p>
@@ -6175,7 +7866,7 @@
         <w:pStyle w:val="Heading2"/>
       </w:pPr>
       <w:r>
-        <w:t>10.1 Docker Compose : 11 services</w:t>
+        <w:t>11.1 Docker Compose : 11 services</w:t>
       </w:r>
     </w:p>
     <w:p>
@@ -7013,7 +8704,7 @@
         <w:pStyle w:val="Heading2"/>
       </w:pPr>
       <w:r>
-        <w:t>10.2 Monitoring en production</w:t>
+        <w:t>11.2 Monitoring en production</w:t>
       </w:r>
     </w:p>
     <w:p>
@@ -7066,7 +8757,7 @@
         <w:pStyle w:val="Heading2"/>
       </w:pPr>
       <w:r>
-        <w:t>10.3 Dashboard Streamlit</w:t>
+        <w:t>11.3 Dashboard Streamlit</w:t>
       </w:r>
     </w:p>
     <w:p>
@@ -7103,7 +8794,7 @@
         <w:pStyle w:val="Heading2"/>
       </w:pPr>
       <w:r>
-        <w:t>10.4 Tests</w:t>
+        <w:t>11.4 Tests</w:t>
       </w:r>
     </w:p>
     <w:p>
@@ -7140,7 +8831,7 @@
         <w:pStyle w:val="Heading2"/>
       </w:pPr>
       <w:r>
-        <w:t>10.5 CI/CD</w:t>
+        <w:t>11.5 CI/CD</w:t>
       </w:r>
     </w:p>
     <w:p>
@@ -7158,7 +8849,7 @@
         <w:pStyle w:val="Heading1"/>
       </w:pPr>
       <w:r>
-        <w:t>11. Problemes rencontres et decisions de pivot</w:t>
+        <w:t>12. Problemes rencontres et decisions de pivot</w:t>
       </w:r>
     </w:p>
     <w:p>
@@ -7166,7 +8857,7 @@
         <w:pStyle w:val="Heading2"/>
       </w:pPr>
       <w:r>
-        <w:t>11.1 Incompatibilite HuggingFace datasets v3+</w:t>
+        <w:t>12.1 Incompatibilite HuggingFace datasets v3+</w:t>
       </w:r>
     </w:p>
     <w:p>
@@ -7196,7 +8887,7 @@
         <w:pStyle w:val="Heading2"/>
       </w:pPr>
       <w:r>
-        <w:t>11.2 Volume de donnees trop important</w:t>
+        <w:t>12.2 Volume de donnees trop important</w:t>
       </w:r>
     </w:p>
     <w:p>
@@ -7226,7 +8917,7 @@
         <w:pStyle w:val="Heading2"/>
       </w:pPr>
       <w:r>
-        <w:t>11.3 Biais de notation inutilisable</w:t>
+        <w:t>12.3 Biais de notation inutilisable</w:t>
       </w:r>
     </w:p>
     <w:p>
@@ -7256,7 +8947,7 @@
         <w:pStyle w:val="Heading2"/>
       </w:pPr>
       <w:r>
-        <w:t>11.4 Cold start massif</w:t>
+        <w:t>12.4 Cold start massif</w:t>
       </w:r>
     </w:p>
     <w:p>
@@ -7286,7 +8977,7 @@
         <w:pStyle w:val="Heading2"/>
       </w:pPr>
       <w:r>
-        <w:t>11.5 Memoire et performance du pipeline</w:t>
+        <w:t>12.5 Memoire et performance du pipeline</w:t>
       </w:r>
     </w:p>
     <w:p>
@@ -7316,7 +9007,7 @@
         <w:pStyle w:val="Heading2"/>
       </w:pPr>
       <w:r>
-        <w:t>11.6 Latence de l'API</w:t>
+        <w:t>12.6 Latence de l'API</w:t>
       </w:r>
     </w:p>
     <w:p>
@@ -7346,7 +9037,7 @@
         <w:pStyle w:val="Heading2"/>
       </w:pPr>
       <w:r>
-        <w:t>11.7 PySpark pour Silver/Gold vs pandas pour Bronze</w:t>
+        <w:t>12.7 PySpark pour Silver/Gold vs pandas pour Bronze</w:t>
       </w:r>
     </w:p>
     <w:p>
@@ -7381,7 +9072,7 @@
         <w:pStyle w:val="Heading1"/>
       </w:pPr>
       <w:r>
-        <w:t>12. Bilan et perspectives</w:t>
+        <w:t>13. Bilan et perspectives</w:t>
       </w:r>
     </w:p>
     <w:p>
@@ -7389,7 +9080,7 @@
         <w:pStyle w:val="Heading2"/>
       </w:pPr>
       <w:r>
-        <w:t>12.1 Ce qui a ete realise</w:t>
+        <w:t>13.1 Ce qui a ete realise</w:t>
       </w:r>
     </w:p>
     <w:p>
@@ -7477,7 +9168,7 @@
         <w:pStyle w:val="Heading2"/>
       </w:pPr>
       <w:r>
-        <w:t>12.2 Choix technologiques valides</w:t>
+        <w:t>13.2 Choix technologiques valides</w:t>
       </w:r>
     </w:p>
     <w:tbl>
@@ -7696,7 +9387,7 @@
         <w:pStyle w:val="Heading2"/>
       </w:pPr>
       <w:r>
-        <w:t>12.3 Perspectives d'evolution</w:t>
+        <w:t>13.3 Perspectives d'evolution</w:t>
       </w:r>
     </w:p>
     <w:p>
@@ -7752,7 +9443,7 @@
         <w:pStyle w:val="Heading2"/>
       </w:pPr>
       <w:r>
-        <w:t>12.4 Conclusion</w:t>
+        <w:t>13.4 Conclusion</w:t>
       </w:r>
     </w:p>
     <w:p>

</xml_diff>